<commit_message>
Ajustar ejecucion Rascal y documentacion final
</commit_message>
<xml_diff>
--- a/docs/informe-entrega-proyecto-3.docx
+++ b/docs/informe-entrega-proyecto-3.docx
@@ -4,772 +4,1035 @@
   <w:body>
     <w:p>
       <w:pPr>
+        <w:pStyle w:val="Title"/>
         <w:jc w:val="center"/>
       </w:pPr>
       <w:r>
-        <w:rPr>
-          <w:rFonts w:ascii="Calibri" w:hAnsi="Calibri" w:eastAsia="Calibri"/>
-          <w:b/>
-          <w:color w:val="1F4E79"/>
-          <w:sz w:val="42"/>
-        </w:rPr>
         <w:t>Informe de entrega - Proyecto 3 PLE</w:t>
       </w:r>
     </w:p>
     <w:p>
-      <w:pPr>
-        <w:jc w:val="center"/>
-      </w:pPr>
       <w:r>
         <w:rPr>
-          <w:rFonts w:ascii="Calibri" w:hAnsi="Calibri" w:eastAsia="Calibri"/>
-          <w:color w:val="505050"/>
-          <w:sz w:val="26"/>
+          <w:b/>
         </w:rPr>
-        <w:t>VeriLang en Rascal</w:t>
+        <w:t>Autor:</w:t>
+      </w:r>
+      <w:r>
+        <w:t xml:space="preserve"> Jorge Sebastián Otálora Bernal</w:t>
+      </w:r>
+    </w:p>
+    <w:p>
+      <w:r>
+        <w:rPr>
+          <w:b/>
+        </w:rPr>
+        <w:t>Código:</w:t>
+      </w:r>
+      <w:r>
+        <w:t xml:space="preserve"> 202312287</w:t>
       </w:r>
     </w:p>
     <w:p>
       <w:pPr>
-        <w:spacing w:after="40"/>
+        <w:pStyle w:val="Heading1"/>
       </w:pPr>
       <w:r>
-        <w:rPr>
-          <w:rFonts w:ascii="Calibri" w:hAnsi="Calibri" w:eastAsia="Calibri"/>
-          <w:b/>
-          <w:color w:val="1F4E79"/>
-          <w:sz w:val="21"/>
-        </w:rPr>
-        <w:t xml:space="preserve">Proyecto: </w:t>
+        <w:t>Objetivo</w:t>
       </w:r>
+    </w:p>
+    <w:p>
       <w:r>
-        <w:rPr>
-          <w:rFonts w:ascii="Calibri" w:hAnsi="Calibri" w:eastAsia="Calibri"/>
-          <w:sz w:val="21"/>
-        </w:rPr>
-        <w:t>js-otalorab12-project-verilang</w:t>
+        <w:t>El objetivo de esta entrega fue continuar la definición de VeriLang implementada en Rascal y convertirla en un lenguaje ejecutable con parser, AST, generación de salida, anotaciones de tipos y validaciones semánticas.</w:t>
       </w:r>
     </w:p>
     <w:p>
       <w:pPr>
-        <w:spacing w:after="40"/>
+        <w:pStyle w:val="Heading1"/>
       </w:pPr>
       <w:r>
-        <w:rPr>
-          <w:rFonts w:ascii="Calibri" w:hAnsi="Calibri" w:eastAsia="Calibri"/>
-          <w:b/>
-          <w:color w:val="1F4E79"/>
-          <w:sz w:val="21"/>
-        </w:rPr>
-        <w:t xml:space="preserve">Entrada principal: </w:t>
+        <w:t>Alcance implementado</w:t>
       </w:r>
+    </w:p>
+    <w:p>
       <w:r>
-        <w:rPr>
-          <w:rFonts w:ascii="Calibri" w:hAnsi="Calibri" w:eastAsia="Calibri"/>
-          <w:sz w:val="21"/>
-        </w:rPr>
-        <w:t>instance/spec1.vl</w:t>
+        <w:t>Se implementaron los siguientes elementos:</w:t>
       </w:r>
     </w:p>
     <w:p>
       <w:pPr>
-        <w:spacing w:after="40"/>
+        <w:ind w:left="317" w:hanging="317"/>
       </w:pPr>
       <w:r>
-        <w:rPr>
-          <w:rFonts w:ascii="Calibri" w:hAnsi="Calibri" w:eastAsia="Calibri"/>
-          <w:b/>
-          <w:color w:val="1F4E79"/>
-          <w:sz w:val="21"/>
-        </w:rPr>
-        <w:t xml:space="preserve">Ejecucion: </w:t>
+        <w:t xml:space="preserve">- gramática concreta de VeriLang en </w:t>
       </w:r>
       <w:r>
         <w:rPr>
-          <w:rFonts w:ascii="Calibri" w:hAnsi="Calibri" w:eastAsia="Calibri"/>
-          <w:sz w:val="21"/>
+          <w:rFonts w:ascii="Consolas" w:hAnsi="Consolas"/>
+          <w:sz w:val="18"/>
         </w:rPr>
-        <w:t>Main.rsc y CheckExamples.rsc</w:t>
+        <w:t>Syntax.rsc</w:t>
+      </w:r>
+      <w:r>
+        <w:t>;</w:t>
       </w:r>
     </w:p>
     <w:p>
       <w:pPr>
-        <w:spacing w:after="40"/>
+        <w:ind w:left="317" w:hanging="317"/>
       </w:pPr>
       <w:r>
-        <w:rPr>
-          <w:rFonts w:ascii="Calibri" w:hAnsi="Calibri" w:eastAsia="Calibri"/>
-          <w:b/>
-          <w:color w:val="1F4E79"/>
-          <w:sz w:val="21"/>
-        </w:rPr>
-        <w:t xml:space="preserve">Documentacion: </w:t>
+        <w:t xml:space="preserve">- AST propio en </w:t>
       </w:r>
       <w:r>
         <w:rPr>
-          <w:rFonts w:ascii="Calibri" w:hAnsi="Calibri" w:eastAsia="Calibri"/>
-          <w:sz w:val="21"/>
+          <w:rFonts w:ascii="Consolas" w:hAnsi="Consolas"/>
+          <w:sz w:val="18"/>
         </w:rPr>
-        <w:t>README.md, docs/informe-entrega-proyecto-3.md e informe-entrega-proyecto-3.docx</w:t>
+        <w:t>AST.rsc</w:t>
+      </w:r>
+      <w:r>
+        <w:t>;</w:t>
       </w:r>
     </w:p>
     <w:p>
       <w:pPr>
-        <w:spacing w:before="240" w:after="80"/>
+        <w:ind w:left="317" w:hanging="317"/>
       </w:pPr>
       <w:r>
+        <w:t xml:space="preserve">- parser de archivos </w:t>
+      </w:r>
+      <w:r>
         <w:rPr>
-          <w:rFonts w:ascii="Calibri" w:hAnsi="Calibri" w:eastAsia="Calibri"/>
-          <w:b/>
-          <w:color w:val="1F4E79"/>
-          <w:sz w:val="30"/>
+          <w:rFonts w:ascii="Consolas" w:hAnsi="Consolas"/>
+          <w:sz w:val="18"/>
         </w:rPr>
-        <w:t>Objetivo</w:t>
+        <w:t>.vl</w:t>
+      </w:r>
+      <w:r>
+        <w:t xml:space="preserve"> en </w:t>
+      </w:r>
+      <w:r>
+        <w:rPr>
+          <w:rFonts w:ascii="Consolas" w:hAnsi="Consolas"/>
+          <w:sz w:val="18"/>
+        </w:rPr>
+        <w:t>Parser.rsc</w:t>
+      </w:r>
+      <w:r>
+        <w:t>;</w:t>
       </w:r>
     </w:p>
     <w:p>
       <w:pPr>
-        <w:spacing w:after="100" w:line="259" w:lineRule="auto"/>
+        <w:ind w:left="317" w:hanging="317"/>
       </w:pPr>
       <w:r>
+        <w:t xml:space="preserve">- conversión del parse tree al AST en </w:t>
+      </w:r>
+      <w:r>
         <w:rPr>
-          <w:rFonts w:ascii="Calibri" w:hAnsi="Calibri" w:eastAsia="Calibri"/>
-          <w:sz w:val="21"/>
+          <w:rFonts w:ascii="Consolas" w:hAnsi="Consolas"/>
+          <w:sz w:val="18"/>
         </w:rPr>
-        <w:t>El objetivo de esta entrega fue continuar la definicion de VeriLang implementada en Rascal y convertirla en un lenguaje ejecutable con parser, AST, generacion de salida, anotaciones de tipos y validaciones semanticas.</w:t>
+        <w:t>ToAST.rsc</w:t>
+      </w:r>
+      <w:r>
+        <w:t>;</w:t>
       </w:r>
     </w:p>
     <w:p>
       <w:pPr>
-        <w:spacing w:before="240" w:after="80"/>
+        <w:ind w:left="317" w:hanging="317"/>
       </w:pPr>
       <w:r>
+        <w:t xml:space="preserve">- generador de salida en consola desde el AST en </w:t>
+      </w:r>
+      <w:r>
         <w:rPr>
-          <w:rFonts w:ascii="Calibri" w:hAnsi="Calibri" w:eastAsia="Calibri"/>
-          <w:b/>
-          <w:color w:val="1F4E79"/>
-          <w:sz w:val="30"/>
+          <w:rFonts w:ascii="Consolas" w:hAnsi="Consolas"/>
+          <w:sz w:val="18"/>
         </w:rPr>
-        <w:t>Alcance implementado</w:t>
+        <w:t>Generator.rsc</w:t>
+      </w:r>
+      <w:r>
+        <w:t>;</w:t>
       </w:r>
     </w:p>
     <w:p>
       <w:pPr>
-        <w:spacing w:after="40"/>
-        <w:ind w:left="360" w:hanging="216"/>
+        <w:ind w:left="317" w:hanging="317"/>
       </w:pPr>
       <w:r>
+        <w:t xml:space="preserve">- validaciones semánticas y de tipos en </w:t>
+      </w:r>
+      <w:r>
         <w:rPr>
-          <w:rFonts w:ascii="Calibri" w:hAnsi="Calibri" w:eastAsia="Calibri"/>
-          <w:sz w:val="21"/>
+          <w:rFonts w:ascii="Consolas" w:hAnsi="Consolas"/>
+          <w:sz w:val="18"/>
         </w:rPr>
-        <w:t>- Gramatica concreta de VeriLang en Syntax.rsc.</w:t>
+        <w:t>TypeChecker.rsc</w:t>
+      </w:r>
+      <w:r>
+        <w:t>;</w:t>
       </w:r>
     </w:p>
     <w:p>
       <w:pPr>
-        <w:spacing w:after="40"/>
-        <w:ind w:left="360" w:hanging="216"/>
+        <w:ind w:left="317" w:hanging="317"/>
       </w:pPr>
       <w:r>
+        <w:t xml:space="preserve">- integración inicial con TypePal en </w:t>
+      </w:r>
+      <w:r>
         <w:rPr>
-          <w:rFonts w:ascii="Calibri" w:hAnsi="Calibri" w:eastAsia="Calibri"/>
-          <w:sz w:val="21"/>
+          <w:rFonts w:ascii="Consolas" w:hAnsi="Consolas"/>
+          <w:sz w:val="18"/>
         </w:rPr>
-        <w:t>- AST propio en AST.rsc.</w:t>
+        <w:t>Checker.rsc</w:t>
+      </w:r>
+      <w:r>
+        <w:t>;</w:t>
       </w:r>
     </w:p>
     <w:p>
       <w:pPr>
-        <w:spacing w:after="40"/>
-        <w:ind w:left="360" w:hanging="216"/>
+        <w:ind w:left="317" w:hanging="317"/>
       </w:pPr>
       <w:r>
+        <w:t xml:space="preserve">- plugin para registrar archivos </w:t>
+      </w:r>
+      <w:r>
         <w:rPr>
-          <w:rFonts w:ascii="Calibri" w:hAnsi="Calibri" w:eastAsia="Calibri"/>
-          <w:sz w:val="21"/>
+          <w:rFonts w:ascii="Consolas" w:hAnsi="Consolas"/>
+          <w:sz w:val="18"/>
         </w:rPr>
-        <w:t>- Parser de archivos .vl en Parser.rsc.</w:t>
+        <w:t>.vl</w:t>
+      </w:r>
+      <w:r>
+        <w:t xml:space="preserve"> en </w:t>
+      </w:r>
+      <w:r>
+        <w:rPr>
+          <w:rFonts w:ascii="Consolas" w:hAnsi="Consolas"/>
+          <w:sz w:val="18"/>
+        </w:rPr>
+        <w:t>Plugin.rsc</w:t>
+      </w:r>
+      <w:r>
+        <w:t>;</w:t>
       </w:r>
     </w:p>
     <w:p>
       <w:pPr>
-        <w:spacing w:after="40"/>
-        <w:ind w:left="360" w:hanging="216"/>
+        <w:ind w:left="317" w:hanging="317"/>
       </w:pPr>
       <w:r>
+        <w:t xml:space="preserve">- ejemplos de entrada en la carpeta </w:t>
+      </w:r>
+      <w:r>
         <w:rPr>
-          <w:rFonts w:ascii="Calibri" w:hAnsi="Calibri" w:eastAsia="Calibri"/>
-          <w:sz w:val="21"/>
+          <w:rFonts w:ascii="Consolas" w:hAnsi="Consolas"/>
+          <w:sz w:val="18"/>
         </w:rPr>
-        <w:t>- Conversion del parse tree al AST en ToAST.rsc.</w:t>
+        <w:t>instance/</w:t>
+      </w:r>
+      <w:r>
+        <w:t>.</w:t>
       </w:r>
     </w:p>
     <w:p>
       <w:pPr>
-        <w:spacing w:after="40"/>
-        <w:ind w:left="360" w:hanging="216"/>
+        <w:pStyle w:val="Heading1"/>
       </w:pPr>
       <w:r>
-        <w:rPr>
-          <w:rFonts w:ascii="Calibri" w:hAnsi="Calibri" w:eastAsia="Calibri"/>
-          <w:sz w:val="21"/>
-        </w:rPr>
-        <w:t>- Generador de salida en consola desde el AST en Generator.rsc.</w:t>
+        <w:t>Cambios frente a iteraciones anteriores</w:t>
+      </w:r>
+    </w:p>
+    <w:p>
+      <w:r>
+        <w:t>La gramática fue ajustada para que cargue correctamente en Rascal 0.42.1 y para corregir problemas detectados en la base anterior:</w:t>
       </w:r>
     </w:p>
     <w:p>
       <w:pPr>
-        <w:spacing w:after="40"/>
-        <w:ind w:left="360" w:hanging="216"/>
+        <w:ind w:left="317" w:hanging="317"/>
       </w:pPr>
       <w:r>
+        <w:t xml:space="preserve">- se uso un nombre de proyecto valido para Rascal: </w:t>
+      </w:r>
+      <w:r>
         <w:rPr>
-          <w:rFonts w:ascii="Calibri" w:hAnsi="Calibri" w:eastAsia="Calibri"/>
-          <w:sz w:val="21"/>
+          <w:rFonts w:ascii="Consolas" w:hAnsi="Consolas"/>
+          <w:sz w:val="18"/>
         </w:rPr>
-        <w:t>- Validaciones semanticas y de tipos en TypeChecker.rsc.</w:t>
+        <w:t>js-otalorab12-project-verilang</w:t>
+      </w:r>
+      <w:r>
+        <w:t>;</w:t>
       </w:r>
     </w:p>
     <w:p>
       <w:pPr>
-        <w:spacing w:after="40"/>
-        <w:ind w:left="360" w:hanging="216"/>
+        <w:ind w:left="317" w:hanging="317"/>
       </w:pPr>
       <w:r>
+        <w:t xml:space="preserve">- se cambió el símbolo inicial a </w:t>
+      </w:r>
+      <w:r>
         <w:rPr>
-          <w:rFonts w:ascii="Calibri" w:hAnsi="Calibri" w:eastAsia="Calibri"/>
-          <w:sz w:val="21"/>
+          <w:rFonts w:ascii="Consolas" w:hAnsi="Consolas"/>
+          <w:sz w:val="18"/>
         </w:rPr>
-        <w:t>- Integracion inicial con TypePal en Checker.rsc.</w:t>
+        <w:t>Program</w:t>
+      </w:r>
+      <w:r>
+        <w:t>;</w:t>
       </w:r>
     </w:p>
     <w:p>
       <w:pPr>
-        <w:spacing w:after="40"/>
-        <w:ind w:left="360" w:hanging="216"/>
+        <w:ind w:left="317" w:hanging="317"/>
       </w:pPr>
       <w:r>
+        <w:t xml:space="preserve">- se evito usar </w:t>
+      </w:r>
+      <w:r>
         <w:rPr>
-          <w:rFonts w:ascii="Calibri" w:hAnsi="Calibri" w:eastAsia="Calibri"/>
-          <w:sz w:val="21"/>
+          <w:rFonts w:ascii="Consolas" w:hAnsi="Consolas"/>
+          <w:sz w:val="18"/>
         </w:rPr>
-        <w:t>- Plugin para registrar archivos .vl en Plugin.rsc.</w:t>
+        <w:t>Module</w:t>
+      </w:r>
+      <w:r>
+        <w:t xml:space="preserve"> como nombre de dato del AST para no chocar con el concepto de modulo de Rascal;</w:t>
       </w:r>
     </w:p>
     <w:p>
       <w:pPr>
-        <w:spacing w:after="40"/>
-        <w:ind w:left="360" w:hanging="216"/>
+        <w:ind w:left="317" w:hanging="317"/>
       </w:pPr>
       <w:r>
-        <w:rPr>
-          <w:rFonts w:ascii="Calibri" w:hAnsi="Calibri" w:eastAsia="Calibri"/>
-          <w:sz w:val="21"/>
-        </w:rPr>
-        <w:t>- Ejemplos de entrada en la carpeta instance/.</w:t>
+        <w:t>- se separó el parser, la conversión a AST, el generador y el chequeador en módulos independientes;</w:t>
       </w:r>
     </w:p>
     <w:p>
       <w:pPr>
-        <w:spacing w:before="240" w:after="80"/>
+        <w:ind w:left="317" w:hanging="317"/>
       </w:pPr>
       <w:r>
+        <w:t xml:space="preserve">- se estandarizó la extensión de entrada como </w:t>
+      </w:r>
+      <w:r>
         <w:rPr>
-          <w:rFonts w:ascii="Calibri" w:hAnsi="Calibri" w:eastAsia="Calibri"/>
-          <w:b/>
-          <w:color w:val="1F4E79"/>
-          <w:sz w:val="30"/>
+          <w:rFonts w:ascii="Consolas" w:hAnsi="Consolas"/>
+          <w:sz w:val="18"/>
         </w:rPr>
-        <w:t>Cambios principales</w:t>
+        <w:t>.vl</w:t>
+      </w:r>
+      <w:r>
+        <w:t>;</w:t>
       </w:r>
     </w:p>
     <w:p>
       <w:pPr>
-        <w:spacing w:after="40"/>
-        <w:ind w:left="360" w:hanging="216"/>
+        <w:ind w:left="317" w:hanging="317"/>
       </w:pPr>
       <w:r>
+        <w:t xml:space="preserve">- se agregó soporte para </w:t>
+      </w:r>
+      <w:r>
         <w:rPr>
-          <w:rFonts w:ascii="Calibri" w:hAnsi="Calibri" w:eastAsia="Calibri"/>
-          <w:sz w:val="21"/>
+          <w:rFonts w:ascii="Consolas" w:hAnsi="Consolas"/>
+          <w:sz w:val="18"/>
         </w:rPr>
-        <w:t>- Se uso un nombre de proyecto valido para Rascal: js-otalorab12-project-verilang.</w:t>
+        <w:t>defdata</w:t>
+      </w:r>
+      <w:r>
+        <w:t>, usado para estructuras de datos con tipo declarado por el usuario;</w:t>
       </w:r>
     </w:p>
     <w:p>
       <w:pPr>
-        <w:spacing w:after="40"/>
-        <w:ind w:left="360" w:hanging="216"/>
+        <w:ind w:left="317" w:hanging="317"/>
       </w:pPr>
       <w:r>
+        <w:t xml:space="preserve">- se agregó soporte para valores anotados como </w:t>
+      </w:r>
+      <w:r>
         <w:rPr>
-          <w:rFonts w:ascii="Calibri" w:hAnsi="Calibri" w:eastAsia="Calibri"/>
-          <w:sz w:val="21"/>
+          <w:rFonts w:ascii="Consolas" w:hAnsi="Consolas"/>
+          <w:sz w:val="18"/>
         </w:rPr>
-        <w:t>- Se cambio el simbolo inicial a Program.</w:t>
+        <w:t>1:Int</w:t>
+      </w:r>
+      <w:r>
+        <w:t xml:space="preserve">, </w:t>
+      </w:r>
+      <w:r>
+        <w:rPr>
+          <w:rFonts w:ascii="Consolas" w:hAnsi="Consolas"/>
+          <w:sz w:val="18"/>
+        </w:rPr>
+        <w:t>true:Bool</w:t>
+      </w:r>
+      <w:r>
+        <w:t xml:space="preserve">, </w:t>
+      </w:r>
+      <w:r>
+        <w:rPr>
+          <w:rFonts w:ascii="Consolas" w:hAnsi="Consolas"/>
+          <w:sz w:val="18"/>
+        </w:rPr>
+        <w:t>'a':Char</w:t>
+      </w:r>
+      <w:r>
+        <w:t xml:space="preserve">, </w:t>
+      </w:r>
+      <w:r>
+        <w:rPr>
+          <w:rFonts w:ascii="Consolas" w:hAnsi="Consolas"/>
+          <w:sz w:val="18"/>
+        </w:rPr>
+        <w:t>"txt":String</w:t>
+      </w:r>
+      <w:r>
+        <w:t xml:space="preserve"> y </w:t>
+      </w:r>
+      <w:r>
+        <w:rPr>
+          <w:rFonts w:ascii="Consolas" w:hAnsi="Consolas"/>
+          <w:sz w:val="18"/>
+        </w:rPr>
+        <w:t>1.5:Real</w:t>
+      </w:r>
+      <w:r>
+        <w:t>.</w:t>
       </w:r>
     </w:p>
     <w:p>
       <w:pPr>
-        <w:spacing w:after="40"/>
-        <w:ind w:left="360" w:hanging="216"/>
+        <w:pStyle w:val="Heading1"/>
       </w:pPr>
       <w:r>
-        <w:rPr>
-          <w:rFonts w:ascii="Calibri" w:hAnsi="Calibri" w:eastAsia="Calibri"/>
-          <w:sz w:val="21"/>
-        </w:rPr>
-        <w:t>- Se evito usar Module como nombre de dato del AST para no chocar con el concepto de modulo de Rascal.</w:t>
+        <w:t>Validaciones</w:t>
+      </w:r>
+    </w:p>
+    <w:p>
+      <w:r>
+        <w:t>El chequeador implementado revisa:</w:t>
       </w:r>
     </w:p>
     <w:p>
       <w:pPr>
-        <w:spacing w:after="40"/>
-        <w:ind w:left="360" w:hanging="216"/>
+        <w:ind w:left="317" w:hanging="317"/>
       </w:pPr>
       <w:r>
-        <w:rPr>
-          <w:rFonts w:ascii="Calibri" w:hAnsi="Calibri" w:eastAsia="Calibri"/>
-          <w:sz w:val="21"/>
-        </w:rPr>
-        <w:t>- Se separo parser, conversion a AST, generador y chequeador en modulos independientes.</w:t>
+        <w:t>- que los tipos usados en operadores, variables y estructuras existan como espacios o tipos base;</w:t>
       </w:r>
     </w:p>
     <w:p>
       <w:pPr>
-        <w:spacing w:after="40"/>
-        <w:ind w:left="360" w:hanging="216"/>
+        <w:ind w:left="317" w:hanging="317"/>
       </w:pPr>
       <w:r>
-        <w:rPr>
-          <w:rFonts w:ascii="Calibri" w:hAnsi="Calibri" w:eastAsia="Calibri"/>
-          <w:sz w:val="21"/>
-        </w:rPr>
-        <w:t>- Se estandarizo la extension de entrada como .vl.</w:t>
+        <w:t>- que el padre de un espacio ordenado exista;</w:t>
       </w:r>
     </w:p>
     <w:p>
       <w:pPr>
-        <w:spacing w:after="40"/>
-        <w:ind w:left="360" w:hanging="216"/>
+        <w:ind w:left="317" w:hanging="317"/>
       </w:pPr>
       <w:r>
-        <w:rPr>
-          <w:rFonts w:ascii="Calibri" w:hAnsi="Calibri" w:eastAsia="Calibri"/>
-          <w:sz w:val="21"/>
-        </w:rPr>
-        <w:t>- Se agrego soporte para defdata y estructuras de datos con tipo declarado por el usuario.</w:t>
+        <w:t>- que las variables usadas en expresiones y ecuaciones esten declaradas;</w:t>
       </w:r>
     </w:p>
     <w:p>
       <w:pPr>
-        <w:spacing w:after="40"/>
-        <w:ind w:left="360" w:hanging="216"/>
+        <w:ind w:left="317" w:hanging="317"/>
       </w:pPr>
       <w:r>
-        <w:rPr>
-          <w:rFonts w:ascii="Calibri" w:hAnsi="Calibri" w:eastAsia="Calibri"/>
-          <w:sz w:val="21"/>
-        </w:rPr>
-        <w:t>- Se agrego soporte para valores anotados: 1:Int, true:Bool, 'a':Char, "txt":String y 1.5:Real.</w:t>
+        <w:t>- que los operadores usados en reglas esten declarados;</w:t>
       </w:r>
     </w:p>
     <w:p>
       <w:pPr>
-        <w:spacing w:before="240" w:after="80"/>
+        <w:ind w:left="317" w:hanging="317"/>
       </w:pPr>
       <w:r>
+        <w:t xml:space="preserve">- que los elementos referenciados dentro de una estructura </w:t>
+      </w:r>
+      <w:r>
         <w:rPr>
-          <w:rFonts w:ascii="Calibri" w:hAnsi="Calibri" w:eastAsia="Calibri"/>
-          <w:b/>
-          <w:color w:val="1F4E79"/>
-          <w:sz w:val="30"/>
+          <w:rFonts w:ascii="Consolas" w:hAnsi="Consolas"/>
+          <w:sz w:val="18"/>
         </w:rPr>
-        <w:t>Validaciones</w:t>
+        <w:t>defdata</w:t>
+      </w:r>
+      <w:r>
+        <w:t xml:space="preserve"> existan;</w:t>
       </w:r>
     </w:p>
     <w:p>
       <w:pPr>
-        <w:spacing w:after="40"/>
-        <w:ind w:left="360" w:hanging="216"/>
+        <w:ind w:left="317" w:hanging="317"/>
       </w:pPr>
       <w:r>
-        <w:rPr>
-          <w:rFonts w:ascii="Calibri" w:hAnsi="Calibri" w:eastAsia="Calibri"/>
-          <w:sz w:val="21"/>
-        </w:rPr>
-        <w:t>- Tipos usados en operadores, variables y estructuras.</w:t>
+        <w:t>- que los literales anotados correspondan con su tipo real y con el tipo declarado de la estructura.</w:t>
       </w:r>
     </w:p>
     <w:p>
       <w:pPr>
-        <w:spacing w:after="40"/>
-        <w:ind w:left="360" w:hanging="216"/>
+        <w:pStyle w:val="Heading1"/>
       </w:pPr>
       <w:r>
+        <w:t>Generación de salida</w:t>
+      </w:r>
+    </w:p>
+    <w:p>
+      <w:r>
+        <w:t xml:space="preserve">El archivo </w:t>
+      </w:r>
+      <w:r>
         <w:rPr>
-          <w:rFonts w:ascii="Calibri" w:hAnsi="Calibri" w:eastAsia="Calibri"/>
-          <w:sz w:val="21"/>
+          <w:rFonts w:ascii="Consolas" w:hAnsi="Consolas"/>
+          <w:sz w:val="18"/>
         </w:rPr>
-        <w:t>- Existencia del padre en espacios ordenados.</w:t>
+        <w:t>Main.rsc</w:t>
+      </w:r>
+      <w:r>
+        <w:t xml:space="preserve"> carga </w:t>
+      </w:r>
+      <w:r>
+        <w:rPr>
+          <w:rFonts w:ascii="Consolas" w:hAnsi="Consolas"/>
+          <w:sz w:val="18"/>
+        </w:rPr>
+        <w:t>instance/spec1.vl</w:t>
+      </w:r>
+      <w:r>
+        <w:t>, construye el AST, genera una representacion textual del programa y muestra el resultado en consola.</w:t>
+      </w:r>
+    </w:p>
+    <w:p>
+      <w:r>
+        <w:t xml:space="preserve">El archivo </w:t>
+      </w:r>
+      <w:r>
+        <w:rPr>
+          <w:rFonts w:ascii="Consolas" w:hAnsi="Consolas"/>
+          <w:sz w:val="18"/>
+        </w:rPr>
+        <w:t>CheckExamples.rsc</w:t>
+      </w:r>
+      <w:r>
+        <w:t xml:space="preserve"> ejecuta los ejemplos incluidos:</w:t>
       </w:r>
     </w:p>
     <w:p>
       <w:pPr>
-        <w:spacing w:after="40"/>
-        <w:ind w:left="360" w:hanging="216"/>
+        <w:ind w:left="317" w:hanging="317"/>
       </w:pPr>
       <w:r>
+        <w:t xml:space="preserve">- </w:t>
+      </w:r>
+      <w:r>
         <w:rPr>
-          <w:rFonts w:ascii="Calibri" w:hAnsi="Calibri" w:eastAsia="Calibri"/>
-          <w:sz w:val="21"/>
+          <w:rFonts w:ascii="Consolas" w:hAnsi="Consolas"/>
+          <w:sz w:val="18"/>
         </w:rPr>
-        <w:t>- Variables usadas en expresiones y ecuaciones.</w:t>
+        <w:t>spec1.vl</w:t>
+      </w:r>
+      <w:r>
+        <w:t>, ejemplo valido general;</w:t>
       </w:r>
     </w:p>
     <w:p>
       <w:pPr>
-        <w:spacing w:after="40"/>
-        <w:ind w:left="360" w:hanging="216"/>
+        <w:ind w:left="317" w:hanging="317"/>
       </w:pPr>
       <w:r>
+        <w:t xml:space="preserve">- </w:t>
+      </w:r>
+      <w:r>
         <w:rPr>
-          <w:rFonts w:ascii="Calibri" w:hAnsi="Calibri" w:eastAsia="Calibri"/>
-          <w:sz w:val="21"/>
+          <w:rFonts w:ascii="Consolas" w:hAnsi="Consolas"/>
+          <w:sz w:val="18"/>
         </w:rPr>
-        <w:t>- Operadores usados en reglas.</w:t>
+        <w:t>spec_typed_values.vl</w:t>
+      </w:r>
+      <w:r>
+        <w:t>, ejemplo valido de valores anotados;</w:t>
       </w:r>
     </w:p>
     <w:p>
       <w:pPr>
-        <w:spacing w:after="40"/>
-        <w:ind w:left="360" w:hanging="216"/>
+        <w:ind w:left="317" w:hanging="317"/>
       </w:pPr>
       <w:r>
+        <w:t xml:space="preserve">- </w:t>
+      </w:r>
+      <w:r>
         <w:rPr>
-          <w:rFonts w:ascii="Calibri" w:hAnsi="Calibri" w:eastAsia="Calibri"/>
-          <w:sz w:val="21"/>
+          <w:rFonts w:ascii="Consolas" w:hAnsi="Consolas"/>
+          <w:sz w:val="18"/>
         </w:rPr>
-        <w:t>- Elementos referenciados dentro de estructuras defdata.</w:t>
+        <w:t>spec_error.vl</w:t>
+      </w:r>
+      <w:r>
+        <w:t>, ejemplo con errores intencionales.</w:t>
       </w:r>
     </w:p>
     <w:p>
       <w:pPr>
-        <w:spacing w:after="40"/>
-        <w:ind w:left="360" w:hanging="216"/>
+        <w:pStyle w:val="Heading1"/>
       </w:pPr>
       <w:r>
-        <w:rPr>
-          <w:rFonts w:ascii="Calibri" w:hAnsi="Calibri" w:eastAsia="Calibri"/>
-          <w:sz w:val="21"/>
-        </w:rPr>
-        <w:t>- Compatibilidad entre literales tipados y el tipo declarado de la estructura.</w:t>
-      </w:r>
-    </w:p>
-    <w:p>
-      <w:pPr>
-        <w:spacing w:before="240" w:after="80"/>
-      </w:pPr>
-      <w:r>
-        <w:rPr>
-          <w:rFonts w:ascii="Calibri" w:hAnsi="Calibri" w:eastAsia="Calibri"/>
-          <w:b/>
-          <w:color w:val="1F4E79"/>
-          <w:sz w:val="30"/>
-        </w:rPr>
-        <w:t>Generacion y ejemplos</w:t>
-      </w:r>
-    </w:p>
-    <w:p>
-      <w:pPr>
-        <w:spacing w:after="100" w:line="259" w:lineRule="auto"/>
-      </w:pPr>
-      <w:r>
-        <w:rPr>
-          <w:rFonts w:ascii="Calibri" w:hAnsi="Calibri" w:eastAsia="Calibri"/>
-          <w:sz w:val="21"/>
-        </w:rPr>
-        <w:t>Main.rsc carga instance/spec1.vl, construye el AST, genera una representacion textual del programa y muestra el resultado en consola. CheckExamples.rsc ejecuta los ejemplos incluidos para validar casos correctos y casos con errores intencionales.</w:t>
-      </w:r>
-    </w:p>
-    <w:p>
-      <w:pPr>
-        <w:spacing w:after="40"/>
-        <w:ind w:left="360" w:hanging="216"/>
-      </w:pPr>
-      <w:r>
-        <w:rPr>
-          <w:rFonts w:ascii="Calibri" w:hAnsi="Calibri" w:eastAsia="Calibri"/>
-          <w:sz w:val="21"/>
-        </w:rPr>
-        <w:t>- instance/spec1.vl: ejemplo valido general con modulos, espacios, operadores, variables, reglas, expresiones y ecuaciones.</w:t>
-      </w:r>
-    </w:p>
-    <w:p>
-      <w:pPr>
-        <w:spacing w:after="40"/>
-        <w:ind w:left="360" w:hanging="216"/>
-      </w:pPr>
-      <w:r>
-        <w:rPr>
-          <w:rFonts w:ascii="Calibri" w:hAnsi="Calibri" w:eastAsia="Calibri"/>
-          <w:sz w:val="21"/>
-        </w:rPr>
-        <w:t>- instance/spec_typed_values.vl: ejemplo valido de valores anotados con Int, Bool, Char, String y Real.</w:t>
-      </w:r>
-    </w:p>
-    <w:p>
-      <w:pPr>
-        <w:spacing w:after="40"/>
-        <w:ind w:left="360" w:hanging="216"/>
-      </w:pPr>
-      <w:r>
-        <w:rPr>
-          <w:rFonts w:ascii="Calibri" w:hAnsi="Calibri" w:eastAsia="Calibri"/>
-          <w:sz w:val="21"/>
-        </w:rPr>
-        <w:t>- instance/spec_error.vl: ejemplo invalido intencional para demostrar errores de tipos y referencias.</w:t>
-      </w:r>
-    </w:p>
-    <w:p>
-      <w:pPr>
-        <w:spacing w:before="240" w:after="80"/>
-      </w:pPr>
-      <w:r>
-        <w:rPr>
-          <w:rFonts w:ascii="Calibri" w:hAnsi="Calibri" w:eastAsia="Calibri"/>
-          <w:b/>
-          <w:color w:val="1F4E79"/>
-          <w:sz w:val="30"/>
-        </w:rPr>
         <w:t>Uso de fuentes externas</w:t>
       </w:r>
     </w:p>
     <w:p>
-      <w:pPr>
-        <w:spacing w:after="100" w:line="259" w:lineRule="auto"/>
-      </w:pPr>
       <w:r>
-        <w:rPr>
-          <w:rFonts w:ascii="Calibri" w:hAnsi="Calibri" w:eastAsia="Calibri"/>
-          <w:sz w:val="21"/>
-        </w:rPr>
         <w:t>Se usaron como guia los siguientes materiales:</w:t>
       </w:r>
     </w:p>
     <w:p>
       <w:pPr>
-        <w:spacing w:after="40"/>
-        <w:ind w:left="360" w:hanging="216"/>
+        <w:ind w:left="317" w:hanging="317"/>
       </w:pPr>
       <w:r>
+        <w:t xml:space="preserve">- </w:t>
+      </w:r>
+      <w:r>
         <w:rPr>
-          <w:rFonts w:ascii="Calibri" w:hAnsi="Calibri" w:eastAsia="Calibri"/>
-          <w:sz w:val="21"/>
+          <w:rFonts w:ascii="Consolas" w:hAnsi="Consolas"/>
+          <w:sz w:val="18"/>
         </w:rPr>
-        <w:t>- ple_project_2.pdf: se uso para confirmar que la iteracion anterior pedia gramatica concreta, resaltado de sintaxis y AST.</w:t>
+        <w:t>ple_project_2.pdf</w:t>
+      </w:r>
+      <w:r>
+        <w:t>: se uso para confirmar que la iteracion anterior pedia gramatica concreta, resaltado de sintaxis y AST.</w:t>
       </w:r>
     </w:p>
     <w:p>
       <w:pPr>
-        <w:spacing w:after="40"/>
-        <w:ind w:left="360" w:hanging="216"/>
+        <w:ind w:left="317" w:hanging="317"/>
       </w:pPr>
       <w:r>
+        <w:t xml:space="preserve">- </w:t>
+      </w:r>
+      <w:r>
         <w:rPr>
-          <w:rFonts w:ascii="Calibri" w:hAnsi="Calibri" w:eastAsia="Calibri"/>
-          <w:sz w:val="21"/>
+          <w:rFonts w:ascii="Consolas" w:hAnsi="Consolas"/>
+          <w:sz w:val="18"/>
         </w:rPr>
-        <w:t>- ple_project_3.pdf: se uso como enunciado principal de esta entrega, especialmente para parser, generacion, TypePal, anotaciones de tipos y validacion de estructuras.</w:t>
+        <w:t>ple_project_3.pdf</w:t>
+      </w:r>
+      <w:r>
+        <w:t>: se uso como enunciado principal de esta entrega, especialmente para parser, generacion, TypePal, anotaciones de tipos y validacion de estructuras.</w:t>
       </w:r>
     </w:p>
     <w:p>
       <w:pPr>
-        <w:spacing w:after="40"/>
-        <w:ind w:left="360" w:hanging="216"/>
+        <w:ind w:left="317" w:hanging="317"/>
       </w:pPr>
       <w:r>
+        <w:t xml:space="preserve">- </w:t>
+      </w:r>
+      <w:r>
         <w:rPr>
-          <w:rFonts w:ascii="Calibri" w:hAnsi="Calibri" w:eastAsia="Calibri"/>
-          <w:sz w:val="21"/>
+          <w:rFonts w:ascii="Consolas" w:hAnsi="Consolas"/>
+          <w:sz w:val="18"/>
         </w:rPr>
-        <w:t>- rascal_tutorial.pdf: se uso como referencia para el flujo de trabajo en Rascal: parser, generador, plugin y TypePal.</w:t>
+        <w:t>rascal_tutorial.pdf</w:t>
+      </w:r>
+      <w:r>
+        <w:t>: se uso como referencia para el flujo de trabajo en Rascal: parser, generador, plugin y TypePal.</w:t>
       </w:r>
     </w:p>
     <w:p>
       <w:pPr>
-        <w:spacing w:after="40"/>
-        <w:ind w:left="360" w:hanging="216"/>
+        <w:ind w:left="317" w:hanging="317"/>
       </w:pPr>
       <w:r>
+        <w:t xml:space="preserve">- </w:t>
+      </w:r>
+      <w:r>
         <w:rPr>
-          <w:rFonts w:ascii="Calibri" w:hAnsi="Calibri" w:eastAsia="Calibri"/>
-          <w:sz w:val="21"/>
+          <w:rFonts w:ascii="Consolas" w:hAnsi="Consolas"/>
+          <w:sz w:val="18"/>
         </w:rPr>
-        <w:t>- Solucion_propuesta_PLE_proyecto_1_202610.pdf: se uso como guia conceptual de la gramatica base de VeriLang.</w:t>
+        <w:t>Solucion_propuesta_PLE_proyecto_1_202610.pdf</w:t>
+      </w:r>
+      <w:r>
+        <w:t xml:space="preserve">: se uso como guia conceptual de la gramatica base de VeriLang: modulos, </w:t>
+      </w:r>
+      <w:r>
+        <w:rPr>
+          <w:rFonts w:ascii="Consolas" w:hAnsi="Consolas"/>
+          <w:sz w:val="18"/>
+        </w:rPr>
+        <w:t>using</w:t>
+      </w:r>
+      <w:r>
+        <w:t>, espacios, operadores curry, variables, reglas, expresiones, ecuaciones y atributos.</w:t>
       </w:r>
     </w:p>
     <w:p>
       <w:pPr>
-        <w:spacing w:after="40"/>
-        <w:ind w:left="360" w:hanging="216"/>
+        <w:ind w:left="317" w:hanging="317"/>
       </w:pPr>
       <w:r>
+        <w:t>- proyecto de referencia compartido por las companeras: se uso como guia de organizacion de modulos Rascal (</w:t>
+      </w:r>
+      <w:r>
         <w:rPr>
-          <w:rFonts w:ascii="Calibri" w:hAnsi="Calibri" w:eastAsia="Calibri"/>
-          <w:sz w:val="21"/>
+          <w:rFonts w:ascii="Consolas" w:hAnsi="Consolas"/>
+          <w:sz w:val="18"/>
         </w:rPr>
-        <w:t>- Proyecto de referencia compartido por las companeras: se uso como guia de organizacion de modulos Rascal y como punto de comparacion para pruebas.</w:t>
+        <w:t>Syntax</w:t>
+      </w:r>
+      <w:r>
+        <w:t xml:space="preserve">, </w:t>
+      </w:r>
+      <w:r>
+        <w:rPr>
+          <w:rFonts w:ascii="Consolas" w:hAnsi="Consolas"/>
+          <w:sz w:val="18"/>
+        </w:rPr>
+        <w:t>AST</w:t>
+      </w:r>
+      <w:r>
+        <w:t xml:space="preserve">, </w:t>
+      </w:r>
+      <w:r>
+        <w:rPr>
+          <w:rFonts w:ascii="Consolas" w:hAnsi="Consolas"/>
+          <w:sz w:val="18"/>
+        </w:rPr>
+        <w:t>Parser</w:t>
+      </w:r>
+      <w:r>
+        <w:t xml:space="preserve">, </w:t>
+      </w:r>
+      <w:r>
+        <w:rPr>
+          <w:rFonts w:ascii="Consolas" w:hAnsi="Consolas"/>
+          <w:sz w:val="18"/>
+        </w:rPr>
+        <w:t>ToAST</w:t>
+      </w:r>
+      <w:r>
+        <w:t xml:space="preserve">, </w:t>
+      </w:r>
+      <w:r>
+        <w:rPr>
+          <w:rFonts w:ascii="Consolas" w:hAnsi="Consolas"/>
+          <w:sz w:val="18"/>
+        </w:rPr>
+        <w:t>Generator</w:t>
+      </w:r>
+      <w:r>
+        <w:t xml:space="preserve">, </w:t>
+      </w:r>
+      <w:r>
+        <w:rPr>
+          <w:rFonts w:ascii="Consolas" w:hAnsi="Consolas"/>
+          <w:sz w:val="18"/>
+        </w:rPr>
+        <w:t>TypeChecker</w:t>
+      </w:r>
+      <w:r>
+        <w:t>) y como punto de comparacion para pruebas.</w:t>
       </w:r>
     </w:p>
     <w:p>
       <w:pPr>
-        <w:spacing w:after="40"/>
-        <w:ind w:left="360" w:hanging="216"/>
+        <w:ind w:left="317" w:hanging="317"/>
       </w:pPr>
       <w:r>
+        <w:t>- repositorios de ejemplo compartidos por el profesor: se revisaron para confirmar la organizacion de ejemplos y ejecucion, sin copiar funcionalidades ajenas al alcance de VeriLang.</w:t>
+      </w:r>
+    </w:p>
+    <w:p>
+      <w:r>
+        <w:t xml:space="preserve">La solución entregada no es una copia directa de esas fuentes. Se realizaron ajustes propios en la gramática, el AST, el conversor a AST, el generador, las validaciones, los ejemplos y la documentación. En particular, se corrigieron nombres, rutas de proyecto, extensión </w:t>
+      </w:r>
+      <w:r>
         <w:rPr>
-          <w:rFonts w:ascii="Calibri" w:hAnsi="Calibri" w:eastAsia="Calibri"/>
-          <w:sz w:val="21"/>
+          <w:rFonts w:ascii="Consolas" w:hAnsi="Consolas"/>
+          <w:sz w:val="18"/>
         </w:rPr>
-        <w:t>- Repositorios de ejemplo compartidos por el profesor: se revisaron para confirmar la organizacion de ejemplos y ejecucion, sin copiar funcionalidades ajenas al alcance de VeriLang.</w:t>
+        <w:t>.vl</w:t>
+      </w:r>
+      <w:r>
+        <w:t xml:space="preserve">, manejo de estructuras </w:t>
+      </w:r>
+      <w:r>
+        <w:rPr>
+          <w:rFonts w:ascii="Consolas" w:hAnsi="Consolas"/>
+          <w:sz w:val="18"/>
+        </w:rPr>
+        <w:t>defdata</w:t>
+      </w:r>
+      <w:r>
+        <w:t>, valores anotados y reglas de validación.</w:t>
       </w:r>
     </w:p>
     <w:p>
       <w:pPr>
-        <w:spacing w:after="100" w:line="259" w:lineRule="auto"/>
+        <w:pStyle w:val="Heading1"/>
       </w:pPr>
       <w:r>
-        <w:rPr>
-          <w:rFonts w:ascii="Calibri" w:hAnsi="Calibri" w:eastAsia="Calibri"/>
-          <w:sz w:val="21"/>
-        </w:rPr>
-        <w:t>La solucion entregada no es una copia directa de esas fuentes. Se realizaron ajustes propios en la gramatica, el AST, el conversor a AST, el generador, las validaciones, los ejemplos y la documentacion. En particular, se corrigieron nombres, rutas de proyecto, extension .vl, manejo de estructuras defdata, valores anotados y reglas de validacion.</w:t>
+        <w:t>Cómo ejecutar</w:t>
+      </w:r>
+    </w:p>
+    <w:p>
+      <w:r>
+        <w:t>La forma recomendada es ejecutar el proyecto desde VS Code con la extension de Rascal:</w:t>
       </w:r>
     </w:p>
     <w:p>
       <w:pPr>
-        <w:spacing w:before="240" w:after="80"/>
+        <w:ind w:left="346" w:hanging="346"/>
       </w:pPr>
       <w:r>
+        <w:t xml:space="preserve">1. abrir </w:t>
+      </w:r>
+      <w:r>
         <w:rPr>
-          <w:rFonts w:ascii="Calibri" w:hAnsi="Calibri" w:eastAsia="Calibri"/>
-          <w:b/>
-          <w:color w:val="1F4E79"/>
-          <w:sz w:val="30"/>
+          <w:rFonts w:ascii="Consolas" w:hAnsi="Consolas"/>
+          <w:sz w:val="18"/>
         </w:rPr>
-        <w:t>Como ejecutar</w:t>
+        <w:t>src/main/rascal/Main.rsc</w:t>
+      </w:r>
+      <w:r>
+        <w:t>;</w:t>
       </w:r>
     </w:p>
     <w:p>
       <w:pPr>
-        <w:spacing w:after="100" w:line="259" w:lineRule="auto"/>
+        <w:ind w:left="346" w:hanging="346"/>
       </w:pPr>
       <w:r>
+        <w:t xml:space="preserve">2. ejecutar la accion </w:t>
+      </w:r>
+      <w:r>
         <w:rPr>
-          <w:rFonts w:ascii="Calibri" w:hAnsi="Calibri" w:eastAsia="Calibri"/>
-          <w:sz w:val="21"/>
+          <w:rFonts w:ascii="Consolas" w:hAnsi="Consolas"/>
+          <w:sz w:val="18"/>
         </w:rPr>
-        <w:t>Desde la raiz del proyecto, ejecutar:</w:t>
+        <w:t>Run in new Rascal terminal</w:t>
+      </w:r>
+      <w:r>
+        <w:t xml:space="preserve"> sobre la funcion </w:t>
+      </w:r>
+      <w:r>
+        <w:rPr>
+          <w:rFonts w:ascii="Consolas" w:hAnsi="Consolas"/>
+          <w:sz w:val="18"/>
+        </w:rPr>
+        <w:t>runDefault</w:t>
+      </w:r>
+      <w:r>
+        <w:t>;</w:t>
       </w:r>
     </w:p>
     <w:p>
       <w:pPr>
-        <w:spacing w:before="40" w:after="160"/>
-        <w:ind w:left="360" w:right="216"/>
-        <w:shd w:fill="F1F5F9"/>
+        <w:ind w:left="346" w:hanging="346"/>
+      </w:pPr>
+      <w:r>
+        <w:t xml:space="preserve">3. revisar en consola la salida generada para </w:t>
+      </w:r>
+      <w:r>
+        <w:rPr>
+          <w:rFonts w:ascii="Consolas" w:hAnsi="Consolas"/>
+          <w:sz w:val="18"/>
+        </w:rPr>
+        <w:t>instance/spec1.vl</w:t>
+      </w:r>
+      <w:r>
+        <w:t xml:space="preserve"> y el resultado del chequeo de tipos.</w:t>
+      </w:r>
+    </w:p>
+    <w:p>
+      <w:r>
+        <w:t xml:space="preserve">Para correr todos los ejemplos, abrir </w:t>
+      </w:r>
+      <w:r>
+        <w:rPr>
+          <w:rFonts w:ascii="Consolas" w:hAnsi="Consolas"/>
+          <w:sz w:val="18"/>
+        </w:rPr>
+        <w:t>src/main/rascal/CheckExamples.rsc</w:t>
+      </w:r>
+      <w:r>
+        <w:t xml:space="preserve"> y ejecutar </w:t>
+      </w:r>
+      <w:r>
+        <w:rPr>
+          <w:rFonts w:ascii="Consolas" w:hAnsi="Consolas"/>
+          <w:sz w:val="18"/>
+        </w:rPr>
+        <w:t>runExamples</w:t>
+      </w:r>
+      <w:r>
+        <w:t>.</w:t>
+      </w:r>
+    </w:p>
+    <w:p>
+      <w:r>
+        <w:t>Tambien puede hacerse desde una terminal de Rascal. Para ejecutar el ejemplo principal:</w:t>
+      </w:r>
+    </w:p>
+    <w:p>
+      <w:pPr>
+        <w:spacing w:before="60" w:after="120"/>
+        <w:ind w:left="259" w:right="259"/>
+        <w:shd w:fill="F1F6FA"/>
       </w:pPr>
       <w:r>
         <w:rPr>
-          <w:rFonts w:ascii="Consolas" w:hAnsi="Consolas" w:eastAsia="Consolas"/>
-          <w:color w:val="1E293B"/>
+          <w:rFonts w:ascii="Consolas" w:hAnsi="Consolas"/>
+          <w:sz w:val="16"/>
+        </w:rPr>
+        <w:t>import Main;</w:t>
+        <w:br/>
+        <w:t>runDefault();</w:t>
+      </w:r>
+    </w:p>
+    <w:p>
+      <w:r>
+        <w:t xml:space="preserve">Para ejecutar cualquier archivo </w:t>
+      </w:r>
+      <w:r>
+        <w:rPr>
+          <w:rFonts w:ascii="Consolas" w:hAnsi="Consolas"/>
           <w:sz w:val="18"/>
+        </w:rPr>
+        <w:t>.vl</w:t>
+      </w:r>
+      <w:r>
+        <w:t xml:space="preserve"> del proyecto:</w:t>
+      </w:r>
+    </w:p>
+    <w:p>
+      <w:pPr>
+        <w:spacing w:before="60" w:after="120"/>
+        <w:ind w:left="259" w:right="259"/>
+        <w:shd w:fill="F1F6FA"/>
+      </w:pPr>
+      <w:r>
+        <w:rPr>
+          <w:rFonts w:ascii="Consolas" w:hAnsi="Consolas"/>
+          <w:sz w:val="16"/>
+        </w:rPr>
+        <w:t>import Main;</w:t>
+        <w:br/>
+        <w:t>runFile(|project://js-otalorab12-project-verilang/instance/spec1.vl|);</w:t>
+      </w:r>
+    </w:p>
+    <w:p>
+      <w:r>
+        <w:t>Para validar todos los ejemplos incluidos:</w:t>
+      </w:r>
+    </w:p>
+    <w:p>
+      <w:pPr>
+        <w:spacing w:before="60" w:after="120"/>
+        <w:ind w:left="259" w:right="259"/>
+        <w:shd w:fill="F1F6FA"/>
+      </w:pPr>
+      <w:r>
+        <w:rPr>
+          <w:rFonts w:ascii="Consolas" w:hAnsi="Consolas"/>
+          <w:sz w:val="16"/>
+        </w:rPr>
+        <w:t>import CheckExamples;</w:t>
+        <w:br/>
+        <w:t>runExamples();</w:t>
+      </w:r>
+    </w:p>
+    <w:p>
+      <w:r>
+        <w:t>Como alternativa, desde la raíz del proyecto se puede ejecutar con la consola del sistema:</w:t>
+      </w:r>
+    </w:p>
+    <w:p>
+      <w:pPr>
+        <w:spacing w:before="60" w:after="120"/>
+        <w:ind w:left="259" w:right="259"/>
+        <w:shd w:fill="F1F6FA"/>
+      </w:pPr>
+      <w:r>
+        <w:rPr>
+          <w:rFonts w:ascii="Consolas" w:hAnsi="Consolas"/>
+          <w:sz w:val="16"/>
         </w:rPr>
         <w:t>java -jar "$env:USERPROFILE\.m2\repository\org\rascalmpl\rascal\0.42.1\rascal-0.42.1.jar" Main</w:t>
       </w:r>
     </w:p>
     <w:p>
-      <w:pPr>
-        <w:spacing w:after="100" w:line="259" w:lineRule="auto"/>
-      </w:pPr>
       <w:r>
-        <w:rPr>
-          <w:rFonts w:ascii="Calibri" w:hAnsi="Calibri" w:eastAsia="Calibri"/>
-          <w:sz w:val="21"/>
-        </w:rPr>
-        <w:t>Para correr todos los ejemplos:</w:t>
+        <w:t>Para correr los ejemplos de validación desde la consola del sistema:</w:t>
       </w:r>
     </w:p>
     <w:p>
       <w:pPr>
-        <w:spacing w:before="40" w:after="160"/>
-        <w:ind w:left="360" w:right="216"/>
-        <w:shd w:fill="F1F5F9"/>
+        <w:spacing w:before="60" w:after="120"/>
+        <w:ind w:left="259" w:right="259"/>
+        <w:shd w:fill="F1F6FA"/>
       </w:pPr>
       <w:r>
         <w:rPr>
-          <w:rFonts w:ascii="Consolas" w:hAnsi="Consolas" w:eastAsia="Consolas"/>
-          <w:color w:val="1E293B"/>
-          <w:sz w:val="18"/>
+          <w:rFonts w:ascii="Consolas" w:hAnsi="Consolas"/>
+          <w:sz w:val="16"/>
         </w:rPr>
         <w:t>java -jar "$env:USERPROFILE\.m2\repository\org\rascalmpl\rascal\0.42.1\rascal-0.42.1.jar" CheckExamples</w:t>
       </w:r>
     </w:p>
     <w:p>
       <w:pPr>
-        <w:spacing w:before="240" w:after="80"/>
+        <w:pStyle w:val="Heading1"/>
       </w:pPr>
       <w:r>
-        <w:rPr>
-          <w:rFonts w:ascii="Calibri" w:hAnsi="Calibri" w:eastAsia="Calibri"/>
-          <w:b/>
-          <w:color w:val="1F4E79"/>
-          <w:sz w:val="30"/>
-        </w:rPr>
-        <w:t>Archivos excluidos</w:t>
+        <w:t>Archivos no incluidos en la entrega</w:t>
       </w:r>
     </w:p>
     <w:p>
-      <w:pPr>
-        <w:spacing w:after="100" w:line="259" w:lineRule="auto"/>
-      </w:pPr>
+      <w:r>
+        <w:t xml:space="preserve">La carpeta </w:t>
+      </w:r>
       <w:r>
         <w:rPr>
-          <w:rFonts w:ascii="Calibri" w:hAnsi="Calibri" w:eastAsia="Calibri"/>
-          <w:sz w:val="21"/>
+          <w:rFonts w:ascii="Consolas" w:hAnsi="Consolas"/>
+          <w:sz w:val="18"/>
         </w:rPr>
-        <w:t>La carpeta referencias/ no debe incluirse en el ZIP final porque contiene PDFs, capturas y proyectos usados como material de consulta. La carpeta target/ tampoco debe incluirse porque contiene artefactos generados por Maven.</w:t>
+        <w:t>referencias/</w:t>
+      </w:r>
+      <w:r>
+        <w:t xml:space="preserve"> no debe incluirse en el ZIP final, porque contiene PDFs, capturas y proyectos usados como material de consulta. La carpeta </w:t>
+      </w:r>
+      <w:r>
+        <w:rPr>
+          <w:rFonts w:ascii="Consolas" w:hAnsi="Consolas"/>
+          <w:sz w:val="18"/>
+        </w:rPr>
+        <w:t>target/</w:t>
+      </w:r>
+      <w:r>
+        <w:t xml:space="preserve"> tampoco debe incluirse, porque contiene artefactos generados por Maven.</w:t>
       </w:r>
     </w:p>
     <w:sectPr>
-      <w:footerReference w:type="default" r:id="rId9"/>
       <w:pgSz w:w="12240" w:h="15840"/>
-      <w:pgMar w:top="1080" w:right="1224" w:bottom="1080" w:left="1224" w:header="720" w:footer="720" w:gutter="0"/>
+      <w:pgMar w:top="936" w:right="1123" w:bottom="936" w:left="1123" w:header="720" w:footer="720" w:gutter="0"/>
       <w:cols w:space="720"/>
       <w:docGrid w:linePitch="360"/>
     </w:sectPr>
   </w:body>
 </w:document>
-</file>
-
-<file path=word/footer1.xml><?xml version="1.0" encoding="utf-8"?>
-<w:ftr xmlns:m="http://schemas.openxmlformats.org/officeDocument/2006/math" xmlns:mc="http://schemas.openxmlformats.org/markup-compatibility/2006" xmlns:mo="http://schemas.microsoft.com/office/mac/office/2008/main" xmlns:mv="urn:schemas-microsoft-com:mac:vml" xmlns:o="urn:schemas-microsoft-com:office:office" xmlns:r="http://schemas.openxmlformats.org/officeDocument/2006/relationships" xmlns:v="urn:schemas-microsoft-com:vml" xmlns:w10="urn:schemas-microsoft-com:office:word" xmlns:w14="http://schemas.microsoft.com/office/word/2010/wordml" xmlns:w="http://schemas.openxmlformats.org/wordprocessingml/2006/main" xmlns:wne="http://schemas.microsoft.com/office/word/2006/wordml" xmlns:wp14="http://schemas.microsoft.com/office/word/2010/wordprocessingDrawing" xmlns:wp="http://schemas.openxmlformats.org/drawingml/2006/wordprocessingDrawing" xmlns:wpc="http://schemas.microsoft.com/office/word/2010/wordprocessingCanvas" xmlns:wpg="http://schemas.microsoft.com/office/word/2010/wordprocessingGroup" xmlns:wpi="http://schemas.microsoft.com/office/word/2010/wordprocessingInk" xmlns:wps="http://schemas.microsoft.com/office/word/2010/wordprocessingShape" mc:Ignorable="w14 wp14">
-  <w:p>
-    <w:pPr>
-      <w:pStyle w:val="Footer"/>
-      <w:jc w:val="center"/>
-    </w:pPr>
-    <w:r>
-      <w:rPr>
-        <w:rFonts w:ascii="Calibri" w:hAnsi="Calibri" w:eastAsia="Calibri"/>
-        <w:color w:val="666666"/>
-        <w:sz w:val="16"/>
-      </w:rPr>
-      <w:t>VeriLang - Proyecto 3 PLE</w:t>
-    </w:r>
-  </w:p>
-</w:ftr>
 </file>
 
 <file path=word/numbering.xml><?xml version="1.0" encoding="utf-8"?>
@@ -1135,9 +1398,12 @@
     <w:name w:val="Normal"/>
     <w:qFormat/>
     <w:rsid w:val="00FC693F"/>
+    <w:pPr>
+      <w:spacing w:after="84" w:line="252" w:lineRule="auto"/>
+    </w:pPr>
     <w:rPr>
       <w:rFonts w:ascii="Calibri" w:hAnsi="Calibri"/>
-      <w:sz w:val="21"/>
+      <w:sz w:val="20"/>
     </w:rPr>
   </w:style>
   <w:style w:type="paragraph" w:styleId="Header">
@@ -1195,15 +1461,15 @@
     <w:pPr>
       <w:keepNext/>
       <w:keepLines/>
-      <w:spacing w:before="480" w:after="0"/>
+      <w:spacing w:before="200" w:after="100"/>
       <w:outlineLvl w:val="0"/>
     </w:pPr>
     <w:rPr>
-      <w:rFonts w:asciiTheme="majorHAnsi" w:eastAsiaTheme="majorEastAsia" w:hAnsiTheme="majorHAnsi" w:cstheme="majorBidi"/>
+      <w:rFonts w:asciiTheme="majorHAnsi" w:eastAsiaTheme="majorEastAsia" w:hAnsiTheme="majorHAnsi" w:cstheme="majorBidi" w:ascii="Calibri" w:hAnsi="Calibri"/>
       <w:b/>
       <w:bCs/>
-      <w:color w:val="365F91" w:themeColor="accent1" w:themeShade="BF"/>
-      <w:sz w:val="28"/>
+      <w:color w:val="1F4E79"/>
+      <w:sz w:val="30"/>
       <w:szCs w:val="28"/>
     </w:rPr>
   </w:style>
@@ -1219,15 +1485,15 @@
     <w:pPr>
       <w:keepNext/>
       <w:keepLines/>
-      <w:spacing w:before="200" w:after="0"/>
+      <w:spacing w:before="200" w:after="100"/>
       <w:outlineLvl w:val="1"/>
     </w:pPr>
     <w:rPr>
-      <w:rFonts w:asciiTheme="majorHAnsi" w:eastAsiaTheme="majorEastAsia" w:hAnsiTheme="majorHAnsi" w:cstheme="majorBidi"/>
+      <w:rFonts w:asciiTheme="majorHAnsi" w:eastAsiaTheme="majorEastAsia" w:hAnsiTheme="majorHAnsi" w:cstheme="majorBidi" w:ascii="Calibri" w:hAnsi="Calibri"/>
       <w:b/>
       <w:bCs/>
-      <w:color w:val="4F81BD" w:themeColor="accent1"/>
-      <w:sz w:val="26"/>
+      <w:color w:val="1F4E79"/>
+      <w:sz w:val="25"/>
       <w:szCs w:val="26"/>
     </w:rPr>
   </w:style>
@@ -1488,11 +1754,12 @@
       <w:contextualSpacing/>
     </w:pPr>
     <w:rPr>
-      <w:rFonts w:asciiTheme="majorHAnsi" w:eastAsiaTheme="majorEastAsia" w:hAnsiTheme="majorHAnsi" w:cstheme="majorBidi"/>
-      <w:color w:val="17365D" w:themeColor="text2" w:themeShade="BF"/>
+      <w:rFonts w:asciiTheme="majorHAnsi" w:eastAsiaTheme="majorEastAsia" w:hAnsiTheme="majorHAnsi" w:cstheme="majorBidi" w:ascii="Calibri" w:hAnsi="Calibri"/>
+      <w:b/>
+      <w:color w:val="1F4E79"/>
       <w:spacing w:val="5"/>
       <w:kern w:val="28"/>
-      <w:sz w:val="52"/>
+      <w:sz w:val="44"/>
       <w:szCs w:val="52"/>
     </w:rPr>
   </w:style>

</xml_diff>

<commit_message>
Reforzar chequeo de tipos para defdata
</commit_message>
<xml_diff>
--- a/docs/informe-entrega-proyecto-3.docx
+++ b/docs/informe-entrega-proyecto-3.docx
@@ -471,6 +471,24 @@
       </w:r>
       <w:r>
         <w:t xml:space="preserve"> existan;</w:t>
+      </w:r>
+    </w:p>
+    <w:p>
+      <w:pPr>
+        <w:ind w:left="317" w:hanging="317"/>
+      </w:pPr>
+      <w:r>
+        <w:t xml:space="preserve">- que los elementos referenciados dentro de una estructura </w:t>
+      </w:r>
+      <w:r>
+        <w:rPr>
+          <w:rFonts w:ascii="Consolas" w:hAnsi="Consolas"/>
+          <w:sz w:val="18"/>
+        </w:rPr>
+        <w:t>defdata</w:t>
+      </w:r>
+      <w:r>
+        <w:t xml:space="preserve"> correspondan con el tipo declarado de esa estructura;</w:t>
       </w:r>
     </w:p>
     <w:p>

</xml_diff>